<commit_message>
edit [worksheet - w8]
</commit_message>
<xml_diff>
--- a/1-G-1/8-week-8/4-worksheet/Computer Worksheet G1 W8.docx
+++ b/1-G-1/8-week-8/4-worksheet/Computer Worksheet G1 W8.docx
@@ -219,6 +219,8 @@
                 <w:rFonts w:asciiTheme="minorBidi" w:hAnsiTheme="minorBidi"/>
                 <w:b/>
                 <w:bCs/>
+                <w:rtl/>
+                <w:lang w:bidi="ar-EG"/>
               </w:rPr>
             </w:pPr>
             <w:r>
@@ -242,7 +244,7 @@
                 <w:rFonts w:asciiTheme="minorBidi" w:hAnsiTheme="minorBidi"/>
                 <w:b/>
                 <w:bCs/>
-                <w:lang w:val="en-GB"/>
+                <w:lang w:bidi="ar-EG"/>
               </w:rPr>
             </w:pPr>
             <w:r>
@@ -250,7 +252,7 @@
                 <w:rFonts w:asciiTheme="minorBidi" w:hAnsiTheme="minorBidi"/>
                 <w:b/>
                 <w:bCs/>
-                <w:lang w:val="en-GB"/>
+                <w:lang w:bidi="ar-EG"/>
               </w:rPr>
               <w:t>8</w:t>
             </w:r>
@@ -295,7 +297,8 @@
                 <w:bCs/>
                 <w:sz w:val="28"/>
                 <w:szCs w:val="28"/>
-                <w:lang w:val="en-GB"/>
+                <w:rtl/>
+                <w:lang w:bidi="ar-EG"/>
               </w:rPr>
             </w:pPr>
             <w:r>
@@ -305,9 +308,8 @@
                 <w:bCs/>
                 <w:sz w:val="28"/>
                 <w:szCs w:val="28"/>
-                <w:lang w:val="en-GB"/>
               </w:rPr>
-              <w:t>Click with Mouse</w:t>
+              <w:t>Need of Computers</w:t>
             </w:r>
           </w:p>
         </w:tc>
@@ -394,7 +396,29 @@
           <w:sz w:val="36"/>
           <w:szCs w:val="36"/>
         </w:rPr>
-        <w:t xml:space="preserve">heet No. (    </w:t>
+        <w:t xml:space="preserve">heet No. </w:t>
+      </w:r>
+      <w:proofErr w:type="gramStart"/>
+      <w:r>
+        <w:rPr>
+          <w:rFonts w:ascii="Lucida Bright" w:hAnsi="Lucida Bright"/>
+          <w:b/>
+          <w:bCs/>
+          <w:sz w:val="36"/>
+          <w:szCs w:val="36"/>
+        </w:rPr>
+        <w:t xml:space="preserve">(  </w:t>
+      </w:r>
+      <w:proofErr w:type="gramEnd"/>
+      <w:r>
+        <w:rPr>
+          <w:rFonts w:ascii="Lucida Bright" w:hAnsi="Lucida Bright"/>
+          <w:b/>
+          <w:bCs/>
+          <w:sz w:val="36"/>
+          <w:szCs w:val="36"/>
+        </w:rPr>
+        <w:t xml:space="preserve">  </w:t>
       </w:r>
       <w:r>
         <w:rPr>
@@ -404,8 +428,19 @@
           <w:sz w:val="36"/>
           <w:szCs w:val="36"/>
         </w:rPr>
-        <w:t>8</w:t>
+        <w:t xml:space="preserve">8 </w:t>
       </w:r>
+      <w:r>
+        <w:rPr>
+          <w:rFonts w:ascii="Lucida Bright" w:hAnsi="Lucida Bright"/>
+          <w:b/>
+          <w:bCs/>
+          <w:sz w:val="36"/>
+          <w:szCs w:val="36"/>
+        </w:rPr>
+        <w:t xml:space="preserve"> </w:t>
+      </w:r>
+      <w:proofErr w:type="gramStart"/>
       <w:r>
         <w:rPr>
           <w:rFonts w:ascii="Lucida Bright" w:hAnsi="Lucida Bright"/>
@@ -416,57 +451,13 @@
         </w:rPr>
         <w:t xml:space="preserve">  )</w:t>
       </w:r>
+      <w:proofErr w:type="gramEnd"/>
     </w:p>
     <w:p>
       <w:pPr>
-        <w:jc w:val="right"/>
+        <w:bidi w:val="0"/>
         <w:rPr>
-          <w:bCs/>
-          <w:sz w:val="36"/>
-          <w:szCs w:val="36"/>
-        </w:rPr>
-      </w:pPr>
-      <w:r>
-        <w:rPr>
-          <w:b/>
-          <w:bCs/>
-          <w:sz w:val="36"/>
-          <w:szCs w:val="36"/>
-          <w:u w:val="single"/>
-        </w:rPr>
-        <w:t>Instruction</w:t>
-      </w:r>
-      <w:r>
-        <w:rPr>
-          <w:b/>
-          <w:bCs/>
-          <w:sz w:val="36"/>
-          <w:szCs w:val="36"/>
-        </w:rPr>
-        <w:t xml:space="preserve">: </w:t>
-      </w:r>
-      <w:r>
-        <w:rPr>
-          <w:bCs/>
-          <w:sz w:val="36"/>
-          <w:szCs w:val="36"/>
-        </w:rPr>
-        <w:t>State whether the below statements are True or False</w:t>
-      </w:r>
-      <w:r>
-        <w:rPr>
-          <w:bCs/>
-          <w:sz w:val="36"/>
-          <w:szCs w:val="36"/>
-        </w:rPr>
-        <w:t>.</w:t>
-      </w:r>
-    </w:p>
-    <w:p>
-      <w:pPr>
-        <w:jc w:val="right"/>
-        <w:rPr>
-          <w:bCs/>
+          <w:rFonts w:ascii="Lucida Bright" w:hAnsi="Lucida Bright"/>
           <w:sz w:val="36"/>
           <w:szCs w:val="36"/>
         </w:rPr>
@@ -474,278 +465,22 @@
     </w:p>
     <w:p>
       <w:pPr>
-        <w:spacing w:line="480" w:lineRule="auto"/>
-        <w:jc w:val="right"/>
+        <w:bidi w:val="0"/>
         <w:rPr>
-          <w:bCs/>
+          <w:rFonts w:ascii="Lucida Bright" w:hAnsi="Lucida Bright"/>
           <w:sz w:val="36"/>
           <w:szCs w:val="36"/>
         </w:rPr>
       </w:pPr>
       <w:r>
         <w:rPr>
-          <w:bCs/>
-          <w:sz w:val="36"/>
-          <w:szCs w:val="36"/>
-        </w:rPr>
-        <w:t xml:space="preserve">1. </w:t>
-      </w:r>
-      <w:r>
-        <w:rPr>
-          <w:bCs/>
-          <w:sz w:val="36"/>
-          <w:szCs w:val="36"/>
-        </w:rPr>
-        <w:t>Click the left button of the mouse 2 times to open the selected object</w:t>
-      </w:r>
-      <w:r>
-        <w:rPr>
-          <w:bCs/>
-          <w:sz w:val="36"/>
-          <w:szCs w:val="36"/>
-        </w:rPr>
-        <w:t>.</w:t>
-      </w:r>
-    </w:p>
-    <w:p>
-      <w:pPr>
-        <w:spacing w:line="480" w:lineRule="auto"/>
-        <w:jc w:val="right"/>
-        <w:rPr>
-          <w:bCs/>
-          <w:sz w:val="36"/>
-          <w:szCs w:val="36"/>
-        </w:rPr>
-      </w:pPr>
-      <w:r>
-        <w:rPr>
-          <w:bCs/>
-          <w:sz w:val="36"/>
-          <w:szCs w:val="36"/>
-        </w:rPr>
-        <w:tab/>
-        <w:t>(a) True          (b) False</w:t>
-      </w:r>
-    </w:p>
-    <w:p>
-      <w:pPr>
-        <w:spacing w:line="480" w:lineRule="auto"/>
-        <w:jc w:val="right"/>
-        <w:rPr>
-          <w:bCs/>
-          <w:sz w:val="36"/>
-          <w:szCs w:val="36"/>
-        </w:rPr>
-      </w:pPr>
-      <w:r>
-        <w:rPr>
-          <w:bCs/>
-          <w:sz w:val="36"/>
-          <w:szCs w:val="36"/>
-        </w:rPr>
-        <w:t xml:space="preserve">2. </w:t>
-      </w:r>
-      <w:r>
-        <w:rPr>
-          <w:bCs/>
-          <w:sz w:val="36"/>
-          <w:szCs w:val="36"/>
-        </w:rPr>
-        <w:t>To move a file, we must drag and drop the file.</w:t>
-      </w:r>
-      <w:r>
-        <w:rPr>
-          <w:bCs/>
-          <w:sz w:val="36"/>
-          <w:szCs w:val="36"/>
-        </w:rPr>
-        <w:t>.</w:t>
-      </w:r>
-    </w:p>
-    <w:p>
-      <w:pPr>
-        <w:spacing w:line="480" w:lineRule="auto"/>
-        <w:jc w:val="right"/>
-        <w:rPr>
-          <w:bCs/>
-          <w:sz w:val="36"/>
-          <w:szCs w:val="36"/>
-        </w:rPr>
-      </w:pPr>
-      <w:r>
-        <w:rPr>
-          <w:bCs/>
-          <w:sz w:val="36"/>
-          <w:szCs w:val="36"/>
-        </w:rPr>
-        <w:tab/>
-        <w:t>(a) True          (b) False</w:t>
-      </w:r>
-    </w:p>
-    <w:p>
-      <w:pPr>
-        <w:spacing w:line="480" w:lineRule="auto"/>
-        <w:jc w:val="right"/>
-        <w:rPr>
-          <w:bCs/>
-          <w:sz w:val="36"/>
-          <w:szCs w:val="36"/>
-        </w:rPr>
-      </w:pPr>
-      <w:r>
-        <w:rPr>
-          <w:bCs/>
-          <w:sz w:val="36"/>
-          <w:szCs w:val="36"/>
-        </w:rPr>
-        <w:t xml:space="preserve">3. </w:t>
-      </w:r>
-      <w:r>
-        <w:rPr>
-          <w:bCs/>
-          <w:sz w:val="36"/>
-          <w:szCs w:val="36"/>
-        </w:rPr>
-        <w:t>Scroll wheel moves the information on a page so we can see it</w:t>
-      </w:r>
-      <w:r>
-        <w:rPr>
-          <w:bCs/>
-          <w:sz w:val="36"/>
-          <w:szCs w:val="36"/>
-        </w:rPr>
-        <w:t>.</w:t>
-      </w:r>
-    </w:p>
-    <w:p>
-      <w:pPr>
-        <w:spacing w:line="480" w:lineRule="auto"/>
-        <w:jc w:val="right"/>
-        <w:rPr>
-          <w:bCs/>
-          <w:sz w:val="36"/>
-          <w:szCs w:val="36"/>
-        </w:rPr>
-      </w:pPr>
-      <w:r>
-        <w:rPr>
-          <w:bCs/>
-          <w:sz w:val="36"/>
-          <w:szCs w:val="36"/>
-        </w:rPr>
-        <w:tab/>
-        <w:t>(a) True          (b) False</w:t>
-      </w:r>
-    </w:p>
-    <w:p>
-      <w:pPr>
-        <w:spacing w:line="480" w:lineRule="auto"/>
-        <w:jc w:val="right"/>
-        <w:rPr>
-          <w:bCs/>
-          <w:sz w:val="36"/>
-          <w:szCs w:val="36"/>
-        </w:rPr>
-      </w:pPr>
-      <w:r>
-        <w:rPr>
-          <w:bCs/>
-          <w:sz w:val="36"/>
-          <w:szCs w:val="36"/>
-        </w:rPr>
-        <w:t xml:space="preserve">4. </w:t>
-      </w:r>
-      <w:r>
-        <w:rPr>
-          <w:bCs/>
-          <w:sz w:val="36"/>
-          <w:szCs w:val="36"/>
-        </w:rPr>
-        <w:t>Scroll is used to select an object</w:t>
-      </w:r>
-      <w:r>
-        <w:rPr>
-          <w:bCs/>
-          <w:sz w:val="36"/>
-          <w:szCs w:val="36"/>
-        </w:rPr>
-        <w:t>.</w:t>
-      </w:r>
-    </w:p>
-    <w:p>
-      <w:pPr>
-        <w:spacing w:line="480" w:lineRule="auto"/>
-        <w:jc w:val="right"/>
-        <w:rPr>
-          <w:bCs/>
-          <w:sz w:val="36"/>
-          <w:szCs w:val="36"/>
-        </w:rPr>
-      </w:pPr>
-      <w:r>
-        <w:rPr>
-          <w:bCs/>
-          <w:sz w:val="36"/>
-          <w:szCs w:val="36"/>
-        </w:rPr>
-        <w:tab/>
-        <w:t>(a) True          (b) False</w:t>
-      </w:r>
-    </w:p>
-    <w:p>
-      <w:pPr>
-        <w:spacing w:line="480" w:lineRule="auto"/>
-        <w:jc w:val="right"/>
-        <w:rPr>
-          <w:bCs/>
-          <w:sz w:val="36"/>
-          <w:szCs w:val="36"/>
-        </w:rPr>
-      </w:pPr>
-      <w:r>
-        <w:rPr>
-          <w:bCs/>
-          <w:sz w:val="36"/>
-          <w:szCs w:val="36"/>
-        </w:rPr>
-        <w:t xml:space="preserve">5. </w:t>
-      </w:r>
-      <w:r>
-        <w:rPr>
-          <w:bCs/>
-          <w:sz w:val="36"/>
-          <w:szCs w:val="36"/>
-        </w:rPr>
-        <w:t xml:space="preserve">The touchpad on a laptop works just like a keyboard </w:t>
-      </w:r>
-      <w:r>
-        <w:rPr>
-          <w:bCs/>
-          <w:sz w:val="36"/>
-          <w:szCs w:val="36"/>
-        </w:rPr>
-        <w:t>.</w:t>
-      </w:r>
-    </w:p>
-    <w:p>
-      <w:pPr>
-        <w:spacing w:line="480" w:lineRule="auto"/>
-        <w:jc w:val="right"/>
-        <w:rPr>
+          <w:rFonts w:ascii="Lucida Bright" w:hAnsi="Lucida Bright"/>
           <w:b/>
           <w:bCs/>
           <w:sz w:val="36"/>
           <w:szCs w:val="36"/>
         </w:rPr>
-      </w:pPr>
-      <w:r>
-        <w:rPr>
-          <w:bCs/>
-          <w:sz w:val="36"/>
-          <w:szCs w:val="36"/>
-        </w:rPr>
-        <w:tab/>
-        <w:t xml:space="preserve">(a) True          (b) False </w:t>
+        <w:t>write the correct name of each part</w:t>
       </w:r>
     </w:p>
     <w:p>
@@ -757,9 +492,1279 @@
           <w:szCs w:val="36"/>
         </w:rPr>
       </w:pPr>
+      <w:r>
+        <w:rPr>
+          <w:rFonts w:ascii="Lucida Bright" w:hAnsi="Lucida Bright"/>
+          <w:b/>
+          <w:bCs/>
+          <w:noProof/>
+          <w:sz w:val="36"/>
+          <w:szCs w:val="36"/>
+        </w:rPr>
+        <w:drawing>
+          <wp:anchor distT="0" distB="0" distL="114300" distR="114300" simplePos="0" relativeHeight="251690496" behindDoc="0" locked="0" layoutInCell="1" allowOverlap="1" wp14:anchorId="60A0A416" wp14:editId="48849D62">
+            <wp:simplePos x="0" y="0"/>
+            <wp:positionH relativeFrom="column">
+              <wp:posOffset>3254168</wp:posOffset>
+            </wp:positionH>
+            <wp:positionV relativeFrom="paragraph">
+              <wp:posOffset>3252470</wp:posOffset>
+            </wp:positionV>
+            <wp:extent cx="3581400" cy="1142069"/>
+            <wp:effectExtent l="0" t="0" r="0" b="1270"/>
+            <wp:wrapNone/>
+            <wp:docPr id="416605738" name="Picture 15"/>
+            <wp:cNvGraphicFramePr>
+              <a:graphicFrameLocks xmlns:a="http://schemas.openxmlformats.org/drawingml/2006/main" noChangeAspect="1"/>
+            </wp:cNvGraphicFramePr>
+            <a:graphic xmlns:a="http://schemas.openxmlformats.org/drawingml/2006/main">
+              <a:graphicData uri="http://schemas.openxmlformats.org/drawingml/2006/picture">
+                <pic:pic xmlns:pic="http://schemas.openxmlformats.org/drawingml/2006/picture">
+                  <pic:nvPicPr>
+                    <pic:cNvPr id="0" name="Picture 6"/>
+                    <pic:cNvPicPr>
+                      <a:picLocks noChangeAspect="1" noChangeArrowheads="1"/>
+                    </pic:cNvPicPr>
+                  </pic:nvPicPr>
+                  <pic:blipFill rotWithShape="1">
+                    <a:blip r:embed="rId7" cstate="print">
+                      <a:extLst>
+                        <a:ext uri="{28A0092B-C50C-407E-A947-70E740481C1C}">
+                          <a14:useLocalDpi xmlns:a14="http://schemas.microsoft.com/office/drawing/2010/main" val="0"/>
+                        </a:ext>
+                      </a:extLst>
+                    </a:blip>
+                    <a:srcRect t="37608"/>
+                    <a:stretch>
+                      <a:fillRect/>
+                    </a:stretch>
+                  </pic:blipFill>
+                  <pic:spPr bwMode="auto">
+                    <a:xfrm>
+                      <a:off x="0" y="0"/>
+                      <a:ext cx="3581400" cy="1142069"/>
+                    </a:xfrm>
+                    <a:prstGeom prst="rect">
+                      <a:avLst/>
+                    </a:prstGeom>
+                    <a:noFill/>
+                    <a:ln>
+                      <a:noFill/>
+                    </a:ln>
+                    <a:extLst>
+                      <a:ext uri="{53640926-AAD7-44D8-BBD7-CCE9431645EC}">
+                        <a14:shadowObscured xmlns:a14="http://schemas.microsoft.com/office/drawing/2010/main"/>
+                      </a:ext>
+                    </a:extLst>
+                  </pic:spPr>
+                </pic:pic>
+              </a:graphicData>
+            </a:graphic>
+            <wp14:sizeRelH relativeFrom="margin">
+              <wp14:pctWidth>0</wp14:pctWidth>
+            </wp14:sizeRelH>
+            <wp14:sizeRelV relativeFrom="margin">
+              <wp14:pctHeight>0</wp14:pctHeight>
+            </wp14:sizeRelV>
+          </wp:anchor>
+        </w:drawing>
+      </w:r>
+      <w:r>
+        <w:rPr>
+          <w:rFonts w:ascii="Lucida Bright" w:hAnsi="Lucida Bright"/>
+          <w:b/>
+          <w:bCs/>
+          <w:noProof/>
+          <w:sz w:val="36"/>
+          <w:szCs w:val="36"/>
+        </w:rPr>
+        <w:drawing>
+          <wp:anchor distT="0" distB="0" distL="114300" distR="114300" simplePos="0" relativeHeight="251689472" behindDoc="0" locked="0" layoutInCell="1" allowOverlap="1" wp14:anchorId="29CE05C4" wp14:editId="41D62C78">
+            <wp:simplePos x="0" y="0"/>
+            <wp:positionH relativeFrom="column">
+              <wp:posOffset>4682490</wp:posOffset>
+            </wp:positionH>
+            <wp:positionV relativeFrom="paragraph">
+              <wp:posOffset>973455</wp:posOffset>
+            </wp:positionV>
+            <wp:extent cx="1508760" cy="1508760"/>
+            <wp:effectExtent l="0" t="0" r="0" b="0"/>
+            <wp:wrapNone/>
+            <wp:docPr id="1150337417" name="Picture 14" descr="A spiral notebook with a blue cover&#10;&#10;AI-generated content may be incorrect."/>
+            <wp:cNvGraphicFramePr>
+              <a:graphicFrameLocks xmlns:a="http://schemas.openxmlformats.org/drawingml/2006/main" noChangeAspect="1"/>
+            </wp:cNvGraphicFramePr>
+            <a:graphic xmlns:a="http://schemas.openxmlformats.org/drawingml/2006/main">
+              <a:graphicData uri="http://schemas.openxmlformats.org/drawingml/2006/picture">
+                <pic:pic xmlns:pic="http://schemas.openxmlformats.org/drawingml/2006/picture">
+                  <pic:nvPicPr>
+                    <pic:cNvPr id="1150337417" name="Picture 14" descr="A spiral notebook with a blue cover&#10;&#10;AI-generated content may be incorrect."/>
+                    <pic:cNvPicPr>
+                      <a:picLocks noChangeAspect="1" noChangeArrowheads="1"/>
+                    </pic:cNvPicPr>
+                  </pic:nvPicPr>
+                  <pic:blipFill>
+                    <a:blip r:embed="rId8">
+                      <a:extLst>
+                        <a:ext uri="{28A0092B-C50C-407E-A947-70E740481C1C}">
+                          <a14:useLocalDpi xmlns:a14="http://schemas.microsoft.com/office/drawing/2010/main" val="0"/>
+                        </a:ext>
+                      </a:extLst>
+                    </a:blip>
+                    <a:srcRect/>
+                    <a:stretch>
+                      <a:fillRect/>
+                    </a:stretch>
+                  </pic:blipFill>
+                  <pic:spPr bwMode="auto">
+                    <a:xfrm>
+                      <a:off x="0" y="0"/>
+                      <a:ext cx="1508760" cy="1508760"/>
+                    </a:xfrm>
+                    <a:prstGeom prst="rect">
+                      <a:avLst/>
+                    </a:prstGeom>
+                    <a:noFill/>
+                    <a:ln>
+                      <a:noFill/>
+                    </a:ln>
+                  </pic:spPr>
+                </pic:pic>
+              </a:graphicData>
+            </a:graphic>
+            <wp14:sizeRelH relativeFrom="margin">
+              <wp14:pctWidth>0</wp14:pctWidth>
+            </wp14:sizeRelH>
+            <wp14:sizeRelV relativeFrom="margin">
+              <wp14:pctHeight>0</wp14:pctHeight>
+            </wp14:sizeRelV>
+          </wp:anchor>
+        </w:drawing>
+      </w:r>
+      <w:r>
+        <w:rPr>
+          <w:rFonts w:ascii="Lucida Bright" w:hAnsi="Lucida Bright"/>
+          <w:b/>
+          <w:bCs/>
+          <w:noProof/>
+          <w:sz w:val="36"/>
+          <w:szCs w:val="36"/>
+        </w:rPr>
+        <w:drawing>
+          <wp:anchor distT="0" distB="0" distL="114300" distR="114300" simplePos="0" relativeHeight="251688448" behindDoc="0" locked="0" layoutInCell="1" allowOverlap="1" wp14:anchorId="640F0805" wp14:editId="14F650C0">
+            <wp:simplePos x="0" y="0"/>
+            <wp:positionH relativeFrom="column">
+              <wp:posOffset>601345</wp:posOffset>
+            </wp:positionH>
+            <wp:positionV relativeFrom="paragraph">
+              <wp:posOffset>3152140</wp:posOffset>
+            </wp:positionV>
+            <wp:extent cx="1500505" cy="1400471"/>
+            <wp:effectExtent l="0" t="0" r="4445" b="9525"/>
+            <wp:wrapNone/>
+            <wp:docPr id="770321719" name="Picture 13" descr="A yellow folder with a white paper inside&#10;&#10;AI-generated content may be incorrect."/>
+            <wp:cNvGraphicFramePr>
+              <a:graphicFrameLocks xmlns:a="http://schemas.openxmlformats.org/drawingml/2006/main" noChangeAspect="1"/>
+            </wp:cNvGraphicFramePr>
+            <a:graphic xmlns:a="http://schemas.openxmlformats.org/drawingml/2006/main">
+              <a:graphicData uri="http://schemas.openxmlformats.org/drawingml/2006/picture">
+                <pic:pic xmlns:pic="http://schemas.openxmlformats.org/drawingml/2006/picture">
+                  <pic:nvPicPr>
+                    <pic:cNvPr id="770321719" name="Picture 13" descr="A yellow folder with a white paper inside&#10;&#10;AI-generated content may be incorrect."/>
+                    <pic:cNvPicPr>
+                      <a:picLocks noChangeAspect="1" noChangeArrowheads="1"/>
+                    </pic:cNvPicPr>
+                  </pic:nvPicPr>
+                  <pic:blipFill rotWithShape="1">
+                    <a:blip r:embed="rId9" cstate="print">
+                      <a:extLst>
+                        <a:ext uri="{28A0092B-C50C-407E-A947-70E740481C1C}">
+                          <a14:useLocalDpi xmlns:a14="http://schemas.microsoft.com/office/drawing/2010/main" val="0"/>
+                        </a:ext>
+                      </a:extLst>
+                    </a:blip>
+                    <a:srcRect l="8696" t="11801" r="7453" b="9938"/>
+                    <a:stretch>
+                      <a:fillRect/>
+                    </a:stretch>
+                  </pic:blipFill>
+                  <pic:spPr bwMode="auto">
+                    <a:xfrm>
+                      <a:off x="0" y="0"/>
+                      <a:ext cx="1500505" cy="1400471"/>
+                    </a:xfrm>
+                    <a:prstGeom prst="rect">
+                      <a:avLst/>
+                    </a:prstGeom>
+                    <a:noFill/>
+                    <a:ln>
+                      <a:noFill/>
+                    </a:ln>
+                    <a:extLst>
+                      <a:ext uri="{53640926-AAD7-44D8-BBD7-CCE9431645EC}">
+                        <a14:shadowObscured xmlns:a14="http://schemas.microsoft.com/office/drawing/2010/main"/>
+                      </a:ext>
+                    </a:extLst>
+                  </pic:spPr>
+                </pic:pic>
+              </a:graphicData>
+            </a:graphic>
+            <wp14:sizeRelH relativeFrom="margin">
+              <wp14:pctWidth>0</wp14:pctWidth>
+            </wp14:sizeRelH>
+            <wp14:sizeRelV relativeFrom="margin">
+              <wp14:pctHeight>0</wp14:pctHeight>
+            </wp14:sizeRelV>
+          </wp:anchor>
+        </w:drawing>
+      </w:r>
+      <w:r>
+        <w:rPr>
+          <w:rFonts w:ascii="Lucida Bright" w:hAnsi="Lucida Bright"/>
+          <w:noProof/>
+          <w:sz w:val="36"/>
+          <w:szCs w:val="36"/>
+        </w:rPr>
+        <w:drawing>
+          <wp:anchor distT="0" distB="0" distL="114300" distR="114300" simplePos="0" relativeHeight="251655680" behindDoc="0" locked="0" layoutInCell="1" allowOverlap="1" wp14:anchorId="19C03F50" wp14:editId="296E8536">
+            <wp:simplePos x="0" y="0"/>
+            <wp:positionH relativeFrom="column">
+              <wp:posOffset>533400</wp:posOffset>
+            </wp:positionH>
+            <wp:positionV relativeFrom="paragraph">
+              <wp:posOffset>1072515</wp:posOffset>
+            </wp:positionV>
+            <wp:extent cx="1546860" cy="1485900"/>
+            <wp:effectExtent l="0" t="0" r="0" b="0"/>
+            <wp:wrapNone/>
+            <wp:docPr id="2027391272" name="Picture 11" descr="A computer monitor and keyboard&#10;&#10;AI-generated content may be incorrect."/>
+            <wp:cNvGraphicFramePr>
+              <a:graphicFrameLocks xmlns:a="http://schemas.openxmlformats.org/drawingml/2006/main" noChangeAspect="1"/>
+            </wp:cNvGraphicFramePr>
+            <a:graphic xmlns:a="http://schemas.openxmlformats.org/drawingml/2006/main">
+              <a:graphicData uri="http://schemas.openxmlformats.org/drawingml/2006/picture">
+                <pic:pic xmlns:pic="http://schemas.openxmlformats.org/drawingml/2006/picture">
+                  <pic:nvPicPr>
+                    <pic:cNvPr id="2027391272" name="Picture 11" descr="A computer monitor and keyboard&#10;&#10;AI-generated content may be incorrect."/>
+                    <pic:cNvPicPr>
+                      <a:picLocks noChangeAspect="1" noChangeArrowheads="1"/>
+                    </pic:cNvPicPr>
+                  </pic:nvPicPr>
+                  <pic:blipFill rotWithShape="1">
+                    <a:blip r:embed="rId10">
+                      <a:extLst>
+                        <a:ext uri="{28A0092B-C50C-407E-A947-70E740481C1C}">
+                          <a14:useLocalDpi xmlns:a14="http://schemas.microsoft.com/office/drawing/2010/main" val="0"/>
+                        </a:ext>
+                      </a:extLst>
+                    </a:blip>
+                    <a:srcRect l="6019" t="5092" b="4630"/>
+                    <a:stretch>
+                      <a:fillRect/>
+                    </a:stretch>
+                  </pic:blipFill>
+                  <pic:spPr bwMode="auto">
+                    <a:xfrm>
+                      <a:off x="0" y="0"/>
+                      <a:ext cx="1546860" cy="1485900"/>
+                    </a:xfrm>
+                    <a:prstGeom prst="rect">
+                      <a:avLst/>
+                    </a:prstGeom>
+                    <a:noFill/>
+                    <a:ln>
+                      <a:noFill/>
+                    </a:ln>
+                    <a:extLst>
+                      <a:ext uri="{53640926-AAD7-44D8-BBD7-CCE9431645EC}">
+                        <a14:shadowObscured xmlns:a14="http://schemas.microsoft.com/office/drawing/2010/main"/>
+                      </a:ext>
+                    </a:extLst>
+                  </pic:spPr>
+                </pic:pic>
+              </a:graphicData>
+            </a:graphic>
+            <wp14:sizeRelH relativeFrom="margin">
+              <wp14:pctWidth>0</wp14:pctWidth>
+            </wp14:sizeRelH>
+            <wp14:sizeRelV relativeFrom="margin">
+              <wp14:pctHeight>0</wp14:pctHeight>
+            </wp14:sizeRelV>
+          </wp:anchor>
+        </w:drawing>
+      </w:r>
+      <w:r>
+        <w:rPr>
+          <w:rFonts w:ascii="Lucida Bright" w:hAnsi="Lucida Bright"/>
+          <w:noProof/>
+          <w:sz w:val="36"/>
+          <w:szCs w:val="36"/>
+        </w:rPr>
+        <mc:AlternateContent>
+          <mc:Choice Requires="wps">
+            <w:drawing>
+              <wp:anchor distT="0" distB="0" distL="114300" distR="114300" simplePos="0" relativeHeight="251649536" behindDoc="0" locked="0" layoutInCell="1" allowOverlap="1" wp14:anchorId="34814AB7" wp14:editId="44BCCFDB">
+                <wp:simplePos x="0" y="0"/>
+                <wp:positionH relativeFrom="column">
+                  <wp:posOffset>4267200</wp:posOffset>
+                </wp:positionH>
+                <wp:positionV relativeFrom="paragraph">
+                  <wp:posOffset>444500</wp:posOffset>
+                </wp:positionV>
+                <wp:extent cx="914400" cy="467995"/>
+                <wp:effectExtent l="0" t="0" r="19050" b="27305"/>
+                <wp:wrapNone/>
+                <wp:docPr id="56520592" name="Rectangle: Rounded Corners 8"/>
+                <wp:cNvGraphicFramePr/>
+                <a:graphic xmlns:a="http://schemas.openxmlformats.org/drawingml/2006/main">
+                  <a:graphicData uri="http://schemas.microsoft.com/office/word/2010/wordprocessingShape">
+                    <wps:wsp>
+                      <wps:cNvSpPr/>
+                      <wps:spPr>
+                        <a:xfrm>
+                          <a:off x="0" y="0"/>
+                          <a:ext cx="914400" cy="467995"/>
+                        </a:xfrm>
+                        <a:prstGeom prst="roundRect">
+                          <a:avLst/>
+                        </a:prstGeom>
+                      </wps:spPr>
+                      <wps:style>
+                        <a:lnRef idx="2">
+                          <a:schemeClr val="accent1">
+                            <a:shade val="15000"/>
+                          </a:schemeClr>
+                        </a:lnRef>
+                        <a:fillRef idx="1">
+                          <a:schemeClr val="accent1"/>
+                        </a:fillRef>
+                        <a:effectRef idx="0">
+                          <a:schemeClr val="accent1"/>
+                        </a:effectRef>
+                        <a:fontRef idx="minor">
+                          <a:schemeClr val="lt1"/>
+                        </a:fontRef>
+                      </wps:style>
+                      <wps:txbx>
+                        <w:txbxContent>
+                          <w:p>
+                            <w:pPr>
+                              <w:jc w:val="center"/>
+                              <w:rPr>
+                                <w:lang w:bidi="ar-EG"/>
+                              </w:rPr>
+                            </w:pPr>
+                            <w:r>
+                              <w:rPr>
+                                <w:lang w:bidi="ar-EG"/>
+                              </w:rPr>
+                              <w:t>Notepad</w:t>
+                            </w:r>
+                          </w:p>
+                        </w:txbxContent>
+                      </wps:txbx>
+                      <wps:bodyPr rot="0" spcFirstLastPara="0" vertOverflow="overflow" horzOverflow="overflow" vert="horz" wrap="square" lIns="91440" tIns="45720" rIns="91440" bIns="45720" numCol="1" spcCol="0" rtlCol="1" fromWordArt="0" anchor="ctr" anchorCtr="0" forceAA="0" compatLnSpc="1">
+                        <a:prstTxWarp prst="textNoShape">
+                          <a:avLst/>
+                        </a:prstTxWarp>
+                        <a:noAutofit/>
+                      </wps:bodyPr>
+                    </wps:wsp>
+                  </a:graphicData>
+                </a:graphic>
+                <wp14:sizeRelV relativeFrom="margin">
+                  <wp14:pctHeight>0</wp14:pctHeight>
+                </wp14:sizeRelV>
+              </wp:anchor>
+            </w:drawing>
+          </mc:Choice>
+          <mc:Fallback>
+            <w:pict>
+              <v:roundrect w14:anchorId="34814AB7" id="Rectangle: Rounded Corners 8" o:spid="_x0000_s1026" style="position:absolute;margin-left:336pt;margin-top:35pt;width:1in;height:36.85pt;z-index:251649536;visibility:visible;mso-wrap-style:square;mso-height-percent:0;mso-wrap-distance-left:9pt;mso-wrap-distance-top:0;mso-wrap-distance-right:9pt;mso-wrap-distance-bottom:0;mso-position-horizontal:absolute;mso-position-horizontal-relative:text;mso-position-vertical:absolute;mso-position-vertical-relative:text;mso-height-percent:0;mso-height-relative:margin;v-text-anchor:middle" arcsize="10923f" o:gfxdata="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" fillcolor="#4f81bd [3204]" strokecolor="#0a121c [484]" strokeweight="2pt">
+                <v:textbox>
+                  <w:txbxContent>
+                    <w:p>
+                      <w:pPr>
+                        <w:jc w:val="center"/>
+                        <w:rPr>
+                          <w:lang w:bidi="ar-EG"/>
+                        </w:rPr>
+                      </w:pPr>
+                      <w:r>
+                        <w:rPr>
+                          <w:lang w:bidi="ar-EG"/>
+                        </w:rPr>
+                        <w:t>Notepad</w:t>
+                      </w:r>
+                    </w:p>
+                  </w:txbxContent>
+                </v:textbox>
+              </v:roundrect>
+            </w:pict>
+          </mc:Fallback>
+        </mc:AlternateContent>
+      </w:r>
+      <w:r>
+        <w:rPr>
+          <w:rFonts w:ascii="Lucida Bright" w:hAnsi="Lucida Bright"/>
+          <w:noProof/>
+          <w:sz w:val="36"/>
+          <w:szCs w:val="36"/>
+        </w:rPr>
+        <mc:AlternateContent>
+          <mc:Choice Requires="wps">
+            <w:drawing>
+              <wp:anchor distT="0" distB="0" distL="114300" distR="114300" simplePos="0" relativeHeight="251653632" behindDoc="0" locked="0" layoutInCell="1" allowOverlap="1" wp14:anchorId="55916B7A" wp14:editId="46D51A09">
+                <wp:simplePos x="0" y="0"/>
+                <wp:positionH relativeFrom="column">
+                  <wp:posOffset>5558155</wp:posOffset>
+                </wp:positionH>
+                <wp:positionV relativeFrom="paragraph">
+                  <wp:posOffset>444500</wp:posOffset>
+                </wp:positionV>
+                <wp:extent cx="914400" cy="468086"/>
+                <wp:effectExtent l="0" t="0" r="19050" b="27305"/>
+                <wp:wrapNone/>
+                <wp:docPr id="906744968" name="Rectangle: Rounded Corners 8"/>
+                <wp:cNvGraphicFramePr/>
+                <a:graphic xmlns:a="http://schemas.openxmlformats.org/drawingml/2006/main">
+                  <a:graphicData uri="http://schemas.microsoft.com/office/word/2010/wordprocessingShape">
+                    <wps:wsp>
+                      <wps:cNvSpPr/>
+                      <wps:spPr>
+                        <a:xfrm>
+                          <a:off x="0" y="0"/>
+                          <a:ext cx="914400" cy="468086"/>
+                        </a:xfrm>
+                        <a:prstGeom prst="roundRect">
+                          <a:avLst/>
+                        </a:prstGeom>
+                      </wps:spPr>
+                      <wps:style>
+                        <a:lnRef idx="2">
+                          <a:schemeClr val="accent1">
+                            <a:shade val="15000"/>
+                          </a:schemeClr>
+                        </a:lnRef>
+                        <a:fillRef idx="1">
+                          <a:schemeClr val="accent1"/>
+                        </a:fillRef>
+                        <a:effectRef idx="0">
+                          <a:schemeClr val="accent1"/>
+                        </a:effectRef>
+                        <a:fontRef idx="minor">
+                          <a:schemeClr val="lt1"/>
+                        </a:fontRef>
+                      </wps:style>
+                      <wps:txbx>
+                        <w:txbxContent>
+                          <w:p>
+                            <w:pPr>
+                              <w:jc w:val="center"/>
+                              <w:rPr>
+                                <w:rtl/>
+                                <w:lang w:bidi="ar-EG"/>
+                              </w:rPr>
+                            </w:pPr>
+                            <w:r>
+                              <w:rPr>
+                                <w:lang w:bidi="ar-EG"/>
+                              </w:rPr>
+                              <w:t>keyboard</w:t>
+                            </w:r>
+                          </w:p>
+                        </w:txbxContent>
+                      </wps:txbx>
+                      <wps:bodyPr rot="0" spcFirstLastPara="0" vertOverflow="overflow" horzOverflow="overflow" vert="horz" wrap="square" lIns="91440" tIns="45720" rIns="91440" bIns="45720" numCol="1" spcCol="0" rtlCol="1" fromWordArt="0" anchor="ctr" anchorCtr="0" forceAA="0" compatLnSpc="1">
+                        <a:prstTxWarp prst="textNoShape">
+                          <a:avLst/>
+                        </a:prstTxWarp>
+                        <a:noAutofit/>
+                      </wps:bodyPr>
+                    </wps:wsp>
+                  </a:graphicData>
+                </a:graphic>
+                <wp14:sizeRelV relativeFrom="margin">
+                  <wp14:pctHeight>0</wp14:pctHeight>
+                </wp14:sizeRelV>
+              </wp:anchor>
+            </w:drawing>
+          </mc:Choice>
+          <mc:Fallback>
+            <w:pict>
+              <v:roundrect w14:anchorId="55916B7A" id="_x0000_s1027" style="position:absolute;margin-left:437.65pt;margin-top:35pt;width:1in;height:36.85pt;z-index:251653632;visibility:visible;mso-wrap-style:square;mso-height-percent:0;mso-wrap-distance-left:9pt;mso-wrap-distance-top:0;mso-wrap-distance-right:9pt;mso-wrap-distance-bottom:0;mso-position-horizontal:absolute;mso-position-horizontal-relative:text;mso-position-vertical:absolute;mso-position-vertical-relative:text;mso-height-percent:0;mso-height-relative:margin;v-text-anchor:middle" arcsize="10923f" o:gfxdata="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" fillcolor="#4f81bd [3204]" strokecolor="#0a121c [484]" strokeweight="2pt">
+                <v:textbox>
+                  <w:txbxContent>
+                    <w:p>
+                      <w:pPr>
+                        <w:jc w:val="center"/>
+                        <w:rPr>
+                          <w:rtl/>
+                          <w:lang w:bidi="ar-EG"/>
+                        </w:rPr>
+                      </w:pPr>
+                      <w:r>
+                        <w:rPr>
+                          <w:lang w:bidi="ar-EG"/>
+                        </w:rPr>
+                        <w:t>keyboard</w:t>
+                      </w:r>
+                    </w:p>
+                  </w:txbxContent>
+                </v:textbox>
+              </v:roundrect>
+            </w:pict>
+          </mc:Fallback>
+        </mc:AlternateContent>
+      </w:r>
+      <w:r>
+        <w:rPr>
+          <w:rFonts w:ascii="Lucida Bright" w:hAnsi="Lucida Bright"/>
+          <w:noProof/>
+          <w:sz w:val="36"/>
+          <w:szCs w:val="36"/>
+        </w:rPr>
+        <mc:AlternateContent>
+          <mc:Choice Requires="wps">
+            <w:drawing>
+              <wp:anchor distT="0" distB="0" distL="114300" distR="114300" simplePos="0" relativeHeight="251645440" behindDoc="0" locked="0" layoutInCell="1" allowOverlap="1" wp14:anchorId="49014CCB" wp14:editId="11FD92F7">
+                <wp:simplePos x="0" y="0"/>
+                <wp:positionH relativeFrom="column">
+                  <wp:posOffset>407670</wp:posOffset>
+                </wp:positionH>
+                <wp:positionV relativeFrom="paragraph">
+                  <wp:posOffset>444500</wp:posOffset>
+                </wp:positionV>
+                <wp:extent cx="914400" cy="468086"/>
+                <wp:effectExtent l="0" t="0" r="19050" b="27305"/>
+                <wp:wrapNone/>
+                <wp:docPr id="538026054" name="Rectangle: Rounded Corners 8"/>
+                <wp:cNvGraphicFramePr/>
+                <a:graphic xmlns:a="http://schemas.openxmlformats.org/drawingml/2006/main">
+                  <a:graphicData uri="http://schemas.microsoft.com/office/word/2010/wordprocessingShape">
+                    <wps:wsp>
+                      <wps:cNvSpPr/>
+                      <wps:spPr>
+                        <a:xfrm>
+                          <a:off x="0" y="0"/>
+                          <a:ext cx="914400" cy="468086"/>
+                        </a:xfrm>
+                        <a:prstGeom prst="roundRect">
+                          <a:avLst/>
+                        </a:prstGeom>
+                      </wps:spPr>
+                      <wps:style>
+                        <a:lnRef idx="2">
+                          <a:schemeClr val="accent1">
+                            <a:shade val="15000"/>
+                          </a:schemeClr>
+                        </a:lnRef>
+                        <a:fillRef idx="1">
+                          <a:schemeClr val="accent1"/>
+                        </a:fillRef>
+                        <a:effectRef idx="0">
+                          <a:schemeClr val="accent1"/>
+                        </a:effectRef>
+                        <a:fontRef idx="minor">
+                          <a:schemeClr val="lt1"/>
+                        </a:fontRef>
+                      </wps:style>
+                      <wps:txbx>
+                        <w:txbxContent>
+                          <w:p>
+                            <w:pPr>
+                              <w:jc w:val="center"/>
+                              <w:rPr>
+                                <w:rtl/>
+                                <w:lang w:bidi="ar-EG"/>
+                              </w:rPr>
+                            </w:pPr>
+                            <w:r>
+                              <w:rPr>
+                                <w:lang w:bidi="ar-EG"/>
+                              </w:rPr>
+                              <w:t>This PC</w:t>
+                            </w:r>
+                          </w:p>
+                        </w:txbxContent>
+                      </wps:txbx>
+                      <wps:bodyPr rot="0" spcFirstLastPara="0" vertOverflow="overflow" horzOverflow="overflow" vert="horz" wrap="square" lIns="91440" tIns="45720" rIns="91440" bIns="45720" numCol="1" spcCol="0" rtlCol="1" fromWordArt="0" anchor="ctr" anchorCtr="0" forceAA="0" compatLnSpc="1">
+                        <a:prstTxWarp prst="textNoShape">
+                          <a:avLst/>
+                        </a:prstTxWarp>
+                        <a:noAutofit/>
+                      </wps:bodyPr>
+                    </wps:wsp>
+                  </a:graphicData>
+                </a:graphic>
+                <wp14:sizeRelV relativeFrom="margin">
+                  <wp14:pctHeight>0</wp14:pctHeight>
+                </wp14:sizeRelV>
+              </wp:anchor>
+            </w:drawing>
+          </mc:Choice>
+          <mc:Fallback>
+            <w:pict>
+              <v:roundrect w14:anchorId="49014CCB" id="_x0000_s1028" style="position:absolute;margin-left:32.1pt;margin-top:35pt;width:1in;height:36.85pt;z-index:251645440;visibility:visible;mso-wrap-style:square;mso-height-percent:0;mso-wrap-distance-left:9pt;mso-wrap-distance-top:0;mso-wrap-distance-right:9pt;mso-wrap-distance-bottom:0;mso-position-horizontal:absolute;mso-position-horizontal-relative:text;mso-position-vertical:absolute;mso-position-vertical-relative:text;mso-height-percent:0;mso-height-relative:margin;v-text-anchor:middle" arcsize="10923f" o:gfxdata="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" fillcolor="#4f81bd [3204]" strokecolor="#0a121c [484]" strokeweight="2pt">
+                <v:textbox>
+                  <w:txbxContent>
+                    <w:p>
+                      <w:pPr>
+                        <w:jc w:val="center"/>
+                        <w:rPr>
+                          <w:rtl/>
+                          <w:lang w:bidi="ar-EG"/>
+                        </w:rPr>
+                      </w:pPr>
+                      <w:r>
+                        <w:rPr>
+                          <w:lang w:bidi="ar-EG"/>
+                        </w:rPr>
+                        <w:t>This PC</w:t>
+                      </w:r>
+                    </w:p>
+                  </w:txbxContent>
+                </v:textbox>
+              </v:roundrect>
+            </w:pict>
+          </mc:Fallback>
+        </mc:AlternateContent>
+      </w:r>
+      <w:r>
+        <w:rPr>
+          <w:rFonts w:ascii="Lucida Bright" w:hAnsi="Lucida Bright"/>
+          <w:noProof/>
+          <w:sz w:val="36"/>
+          <w:szCs w:val="36"/>
+        </w:rPr>
+        <mc:AlternateContent>
+          <mc:Choice Requires="wps">
+            <w:drawing>
+              <wp:anchor distT="0" distB="0" distL="114300" distR="114300" simplePos="0" relativeHeight="251661824" behindDoc="0" locked="0" layoutInCell="1" allowOverlap="1" wp14:anchorId="693A069B" wp14:editId="272206B6">
+                <wp:simplePos x="0" y="0"/>
+                <wp:positionH relativeFrom="column">
+                  <wp:posOffset>536030</wp:posOffset>
+                </wp:positionH>
+                <wp:positionV relativeFrom="paragraph">
+                  <wp:posOffset>2995386</wp:posOffset>
+                </wp:positionV>
+                <wp:extent cx="1687286" cy="0"/>
+                <wp:effectExtent l="57150" t="38100" r="65405" b="95250"/>
+                <wp:wrapNone/>
+                <wp:docPr id="1478695497" name="Straight Connector 9"/>
+                <wp:cNvGraphicFramePr/>
+                <a:graphic xmlns:a="http://schemas.openxmlformats.org/drawingml/2006/main">
+                  <a:graphicData uri="http://schemas.microsoft.com/office/word/2010/wordprocessingShape">
+                    <wps:wsp>
+                      <wps:cNvCnPr/>
+                      <wps:spPr>
+                        <a:xfrm>
+                          <a:off x="0" y="0"/>
+                          <a:ext cx="1687286" cy="0"/>
+                        </a:xfrm>
+                        <a:prstGeom prst="line">
+                          <a:avLst/>
+                        </a:prstGeom>
+                      </wps:spPr>
+                      <wps:style>
+                        <a:lnRef idx="3">
+                          <a:schemeClr val="dk1"/>
+                        </a:lnRef>
+                        <a:fillRef idx="0">
+                          <a:schemeClr val="dk1"/>
+                        </a:fillRef>
+                        <a:effectRef idx="2">
+                          <a:schemeClr val="dk1"/>
+                        </a:effectRef>
+                        <a:fontRef idx="minor">
+                          <a:schemeClr val="tx1"/>
+                        </a:fontRef>
+                      </wps:style>
+                      <wps:bodyPr/>
+                    </wps:wsp>
+                  </a:graphicData>
+                </a:graphic>
+              </wp:anchor>
+            </w:drawing>
+          </mc:Choice>
+          <mc:Fallback>
+            <w:pict>
+              <v:line w14:anchorId="4B2D2BA3" id="Straight Connector 9" o:spid="_x0000_s1026" style="position:absolute;left:0;text-align:left;z-index:251661824;visibility:visible;mso-wrap-style:square;mso-wrap-distance-left:9pt;mso-wrap-distance-top:0;mso-wrap-distance-right:9pt;mso-wrap-distance-bottom:0;mso-position-horizontal:absolute;mso-position-horizontal-relative:text;mso-position-vertical:absolute;mso-position-vertical-relative:text" from="42.2pt,235.85pt" to="175.05pt,235.85pt" o:gfxdata="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" strokecolor="black [3200]" strokeweight="3pt">
+                <v:shadow on="t" color="black" opacity="22937f" origin=",.5" offset="0,.63889mm"/>
+              </v:line>
+            </w:pict>
+          </mc:Fallback>
+        </mc:AlternateContent>
+      </w:r>
+      <w:r>
+        <w:rPr>
+          <w:rFonts w:ascii="Lucida Bright" w:hAnsi="Lucida Bright"/>
+          <w:noProof/>
+          <w:sz w:val="36"/>
+          <w:szCs w:val="36"/>
+        </w:rPr>
+        <mc:AlternateContent>
+          <mc:Choice Requires="wps">
+            <w:drawing>
+              <wp:anchor distT="0" distB="0" distL="114300" distR="114300" simplePos="0" relativeHeight="251684352" behindDoc="0" locked="0" layoutInCell="1" allowOverlap="1" wp14:anchorId="45752BB0" wp14:editId="3B19CAB1">
+                <wp:simplePos x="0" y="0"/>
+                <wp:positionH relativeFrom="column">
+                  <wp:posOffset>4604385</wp:posOffset>
+                </wp:positionH>
+                <wp:positionV relativeFrom="paragraph">
+                  <wp:posOffset>2996474</wp:posOffset>
+                </wp:positionV>
+                <wp:extent cx="1687286" cy="0"/>
+                <wp:effectExtent l="57150" t="38100" r="65405" b="95250"/>
+                <wp:wrapNone/>
+                <wp:docPr id="1059584092" name="Straight Connector 9"/>
+                <wp:cNvGraphicFramePr/>
+                <a:graphic xmlns:a="http://schemas.openxmlformats.org/drawingml/2006/main">
+                  <a:graphicData uri="http://schemas.microsoft.com/office/word/2010/wordprocessingShape">
+                    <wps:wsp>
+                      <wps:cNvCnPr/>
+                      <wps:spPr>
+                        <a:xfrm>
+                          <a:off x="0" y="0"/>
+                          <a:ext cx="1687286" cy="0"/>
+                        </a:xfrm>
+                        <a:prstGeom prst="line">
+                          <a:avLst/>
+                        </a:prstGeom>
+                      </wps:spPr>
+                      <wps:style>
+                        <a:lnRef idx="3">
+                          <a:schemeClr val="dk1"/>
+                        </a:lnRef>
+                        <a:fillRef idx="0">
+                          <a:schemeClr val="dk1"/>
+                        </a:fillRef>
+                        <a:effectRef idx="2">
+                          <a:schemeClr val="dk1"/>
+                        </a:effectRef>
+                        <a:fontRef idx="minor">
+                          <a:schemeClr val="tx1"/>
+                        </a:fontRef>
+                      </wps:style>
+                      <wps:bodyPr/>
+                    </wps:wsp>
+                  </a:graphicData>
+                </a:graphic>
+              </wp:anchor>
+            </w:drawing>
+          </mc:Choice>
+          <mc:Fallback>
+            <w:pict>
+              <v:line w14:anchorId="55831008" id="Straight Connector 9" o:spid="_x0000_s1026" style="position:absolute;left:0;text-align:left;z-index:251684352;visibility:visible;mso-wrap-style:square;mso-wrap-distance-left:9pt;mso-wrap-distance-top:0;mso-wrap-distance-right:9pt;mso-wrap-distance-bottom:0;mso-position-horizontal:absolute;mso-position-horizontal-relative:text;mso-position-vertical:absolute;mso-position-vertical-relative:text" from="362.55pt,235.95pt" to="495.4pt,235.95pt" o:gfxdata="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" strokecolor="black [3200]" strokeweight="3pt">
+                <v:shadow on="t" color="black" opacity="22937f" origin=",.5" offset="0,.63889mm"/>
+              </v:line>
+            </w:pict>
+          </mc:Fallback>
+        </mc:AlternateContent>
+      </w:r>
+      <w:r>
+        <w:rPr>
+          <w:rFonts w:ascii="Lucida Bright" w:hAnsi="Lucida Bright"/>
+          <w:noProof/>
+          <w:sz w:val="36"/>
+          <w:szCs w:val="36"/>
+        </w:rPr>
+        <mc:AlternateContent>
+          <mc:Choice Requires="wps">
+            <w:drawing>
+              <wp:anchor distT="0" distB="0" distL="114300" distR="114300" simplePos="0" relativeHeight="251677184" behindDoc="0" locked="0" layoutInCell="1" allowOverlap="1" wp14:anchorId="6781B447" wp14:editId="75EDE8AC">
+                <wp:simplePos x="0" y="0"/>
+                <wp:positionH relativeFrom="column">
+                  <wp:posOffset>4607288</wp:posOffset>
+                </wp:positionH>
+                <wp:positionV relativeFrom="paragraph">
+                  <wp:posOffset>5124450</wp:posOffset>
+                </wp:positionV>
+                <wp:extent cx="1687286" cy="0"/>
+                <wp:effectExtent l="57150" t="38100" r="65405" b="95250"/>
+                <wp:wrapNone/>
+                <wp:docPr id="934568660" name="Straight Connector 9"/>
+                <wp:cNvGraphicFramePr/>
+                <a:graphic xmlns:a="http://schemas.openxmlformats.org/drawingml/2006/main">
+                  <a:graphicData uri="http://schemas.microsoft.com/office/word/2010/wordprocessingShape">
+                    <wps:wsp>
+                      <wps:cNvCnPr/>
+                      <wps:spPr>
+                        <a:xfrm>
+                          <a:off x="0" y="0"/>
+                          <a:ext cx="1687286" cy="0"/>
+                        </a:xfrm>
+                        <a:prstGeom prst="line">
+                          <a:avLst/>
+                        </a:prstGeom>
+                      </wps:spPr>
+                      <wps:style>
+                        <a:lnRef idx="3">
+                          <a:schemeClr val="dk1"/>
+                        </a:lnRef>
+                        <a:fillRef idx="0">
+                          <a:schemeClr val="dk1"/>
+                        </a:fillRef>
+                        <a:effectRef idx="2">
+                          <a:schemeClr val="dk1"/>
+                        </a:effectRef>
+                        <a:fontRef idx="minor">
+                          <a:schemeClr val="tx1"/>
+                        </a:fontRef>
+                      </wps:style>
+                      <wps:bodyPr/>
+                    </wps:wsp>
+                  </a:graphicData>
+                </a:graphic>
+              </wp:anchor>
+            </w:drawing>
+          </mc:Choice>
+          <mc:Fallback>
+            <w:pict>
+              <v:line w14:anchorId="567D681C" id="Straight Connector 9" o:spid="_x0000_s1026" style="position:absolute;left:0;text-align:left;z-index:251677184;visibility:visible;mso-wrap-style:square;mso-wrap-distance-left:9pt;mso-wrap-distance-top:0;mso-wrap-distance-right:9pt;mso-wrap-distance-bottom:0;mso-position-horizontal:absolute;mso-position-horizontal-relative:text;mso-position-vertical:absolute;mso-position-vertical-relative:text" from="362.8pt,403.5pt" to="495.65pt,403.5pt" o:gfxdata="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" strokecolor="black [3200]" strokeweight="3pt">
+                <v:shadow on="t" color="black" opacity="22937f" origin=",.5" offset="0,.63889mm"/>
+              </v:line>
+            </w:pict>
+          </mc:Fallback>
+        </mc:AlternateContent>
+      </w:r>
+      <w:r>
+        <w:rPr>
+          <w:rFonts w:ascii="Lucida Bright" w:hAnsi="Lucida Bright"/>
+          <w:noProof/>
+          <w:sz w:val="36"/>
+          <w:szCs w:val="36"/>
+        </w:rPr>
+        <mc:AlternateContent>
+          <mc:Choice Requires="wps">
+            <w:drawing>
+              <wp:anchor distT="0" distB="0" distL="114300" distR="114300" simplePos="0" relativeHeight="251670016" behindDoc="0" locked="0" layoutInCell="1" allowOverlap="1" wp14:anchorId="4304095E" wp14:editId="0CE830CB">
+                <wp:simplePos x="0" y="0"/>
+                <wp:positionH relativeFrom="column">
+                  <wp:posOffset>601345</wp:posOffset>
+                </wp:positionH>
+                <wp:positionV relativeFrom="paragraph">
+                  <wp:posOffset>5124541</wp:posOffset>
+                </wp:positionV>
+                <wp:extent cx="1687286" cy="0"/>
+                <wp:effectExtent l="57150" t="38100" r="65405" b="95250"/>
+                <wp:wrapNone/>
+                <wp:docPr id="474673301" name="Straight Connector 9"/>
+                <wp:cNvGraphicFramePr/>
+                <a:graphic xmlns:a="http://schemas.openxmlformats.org/drawingml/2006/main">
+                  <a:graphicData uri="http://schemas.microsoft.com/office/word/2010/wordprocessingShape">
+                    <wps:wsp>
+                      <wps:cNvCnPr/>
+                      <wps:spPr>
+                        <a:xfrm>
+                          <a:off x="0" y="0"/>
+                          <a:ext cx="1687286" cy="0"/>
+                        </a:xfrm>
+                        <a:prstGeom prst="line">
+                          <a:avLst/>
+                        </a:prstGeom>
+                      </wps:spPr>
+                      <wps:style>
+                        <a:lnRef idx="3">
+                          <a:schemeClr val="dk1"/>
+                        </a:lnRef>
+                        <a:fillRef idx="0">
+                          <a:schemeClr val="dk1"/>
+                        </a:fillRef>
+                        <a:effectRef idx="2">
+                          <a:schemeClr val="dk1"/>
+                        </a:effectRef>
+                        <a:fontRef idx="minor">
+                          <a:schemeClr val="tx1"/>
+                        </a:fontRef>
+                      </wps:style>
+                      <wps:bodyPr/>
+                    </wps:wsp>
+                  </a:graphicData>
+                </a:graphic>
+              </wp:anchor>
+            </w:drawing>
+          </mc:Choice>
+          <mc:Fallback>
+            <w:pict>
+              <v:line w14:anchorId="1C6E3BA7" id="Straight Connector 9" o:spid="_x0000_s1026" style="position:absolute;left:0;text-align:left;z-index:251670016;visibility:visible;mso-wrap-style:square;mso-wrap-distance-left:9pt;mso-wrap-distance-top:0;mso-wrap-distance-right:9pt;mso-wrap-distance-bottom:0;mso-position-horizontal:absolute;mso-position-horizontal-relative:text;mso-position-vertical:absolute;mso-position-vertical-relative:text" from="47.35pt,403.5pt" to="180.2pt,403.5pt" o:gfxdata="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" strokecolor="black [3200]" strokeweight="3pt">
+                <v:shadow on="t" color="black" opacity="22937f" origin=",.5" offset="0,.63889mm"/>
+              </v:line>
+            </w:pict>
+          </mc:Fallback>
+        </mc:AlternateContent>
+      </w:r>
+    </w:p>
+    <w:p>
+      <w:pPr>
+        <w:bidi w:val="0"/>
+        <w:rPr>
+          <w:rFonts w:ascii="Lucida Bright" w:hAnsi="Lucida Bright"/>
+          <w:sz w:val="36"/>
+          <w:szCs w:val="36"/>
+        </w:rPr>
+      </w:pPr>
+      <w:r>
+        <w:rPr>
+          <w:rFonts w:ascii="Lucida Bright" w:hAnsi="Lucida Bright"/>
+          <w:noProof/>
+          <w:sz w:val="36"/>
+          <w:szCs w:val="36"/>
+        </w:rPr>
+        <mc:AlternateContent>
+          <mc:Choice Requires="wps">
+            <w:drawing>
+              <wp:anchor distT="0" distB="0" distL="114300" distR="114300" simplePos="0" relativeHeight="251687424" behindDoc="0" locked="0" layoutInCell="1" allowOverlap="1" wp14:anchorId="43A85293" wp14:editId="0B043B59">
+                <wp:simplePos x="0" y="0"/>
+                <wp:positionH relativeFrom="column">
+                  <wp:posOffset>2971800</wp:posOffset>
+                </wp:positionH>
+                <wp:positionV relativeFrom="paragraph">
+                  <wp:posOffset>192405</wp:posOffset>
+                </wp:positionV>
+                <wp:extent cx="914400" cy="467995"/>
+                <wp:effectExtent l="0" t="0" r="19050" b="27305"/>
+                <wp:wrapNone/>
+                <wp:docPr id="2059096915" name="Rectangle: Rounded Corners 8"/>
+                <wp:cNvGraphicFramePr/>
+                <a:graphic xmlns:a="http://schemas.openxmlformats.org/drawingml/2006/main">
+                  <a:graphicData uri="http://schemas.microsoft.com/office/word/2010/wordprocessingShape">
+                    <wps:wsp>
+                      <wps:cNvSpPr/>
+                      <wps:spPr>
+                        <a:xfrm>
+                          <a:off x="0" y="0"/>
+                          <a:ext cx="914400" cy="467995"/>
+                        </a:xfrm>
+                        <a:prstGeom prst="roundRect">
+                          <a:avLst/>
+                        </a:prstGeom>
+                      </wps:spPr>
+                      <wps:style>
+                        <a:lnRef idx="2">
+                          <a:schemeClr val="accent1">
+                            <a:shade val="15000"/>
+                          </a:schemeClr>
+                        </a:lnRef>
+                        <a:fillRef idx="1">
+                          <a:schemeClr val="accent1"/>
+                        </a:fillRef>
+                        <a:effectRef idx="0">
+                          <a:schemeClr val="accent1"/>
+                        </a:effectRef>
+                        <a:fontRef idx="minor">
+                          <a:schemeClr val="lt1"/>
+                        </a:fontRef>
+                      </wps:style>
+                      <wps:txbx>
+                        <w:txbxContent>
+                          <w:p>
+                            <w:pPr>
+                              <w:jc w:val="center"/>
+                              <w:rPr>
+                                <w:lang w:bidi="ar-EG"/>
+                              </w:rPr>
+                            </w:pPr>
+                            <w:r>
+                              <w:rPr>
+                                <w:lang w:bidi="ar-EG"/>
+                              </w:rPr>
+                              <w:t>Tablet</w:t>
+                            </w:r>
+                          </w:p>
+                        </w:txbxContent>
+                      </wps:txbx>
+                      <wps:bodyPr rot="0" spcFirstLastPara="0" vertOverflow="overflow" horzOverflow="overflow" vert="horz" wrap="square" lIns="91440" tIns="45720" rIns="91440" bIns="45720" numCol="1" spcCol="0" rtlCol="1" fromWordArt="0" anchor="ctr" anchorCtr="0" forceAA="0" compatLnSpc="1">
+                        <a:prstTxWarp prst="textNoShape">
+                          <a:avLst/>
+                        </a:prstTxWarp>
+                        <a:noAutofit/>
+                      </wps:bodyPr>
+                    </wps:wsp>
+                  </a:graphicData>
+                </a:graphic>
+                <wp14:sizeRelV relativeFrom="margin">
+                  <wp14:pctHeight>0</wp14:pctHeight>
+                </wp14:sizeRelV>
+              </wp:anchor>
+            </w:drawing>
+          </mc:Choice>
+          <mc:Fallback>
+            <w:pict>
+              <v:roundrect w14:anchorId="43A85293" id="_x0000_s1029" style="position:absolute;margin-left:234pt;margin-top:15.15pt;width:1in;height:36.85pt;z-index:251687424;visibility:visible;mso-wrap-style:square;mso-height-percent:0;mso-wrap-distance-left:9pt;mso-wrap-distance-top:0;mso-wrap-distance-right:9pt;mso-wrap-distance-bottom:0;mso-position-horizontal:absolute;mso-position-horizontal-relative:text;mso-position-vertical:absolute;mso-position-vertical-relative:text;mso-height-percent:0;mso-height-relative:margin;v-text-anchor:middle" arcsize="10923f" o:gfxdata="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" fillcolor="#4f81bd [3204]" strokecolor="#0a121c [484]" strokeweight="2pt">
+                <v:textbox>
+                  <w:txbxContent>
+                    <w:p>
+                      <w:pPr>
+                        <w:jc w:val="center"/>
+                        <w:rPr>
+                          <w:lang w:bidi="ar-EG"/>
+                        </w:rPr>
+                      </w:pPr>
+                      <w:r>
+                        <w:rPr>
+                          <w:lang w:bidi="ar-EG"/>
+                        </w:rPr>
+                        <w:t>Tablet</w:t>
+                      </w:r>
+                    </w:p>
+                  </w:txbxContent>
+                </v:textbox>
+              </v:roundrect>
+            </w:pict>
+          </mc:Fallback>
+        </mc:AlternateContent>
+      </w:r>
+      <w:r>
+        <w:rPr>
+          <w:rFonts w:ascii="Lucida Bright" w:hAnsi="Lucida Bright"/>
+          <w:noProof/>
+          <w:sz w:val="36"/>
+          <w:szCs w:val="36"/>
+        </w:rPr>
+        <mc:AlternateContent>
+          <mc:Choice Requires="wps">
+            <w:drawing>
+              <wp:anchor distT="0" distB="0" distL="114300" distR="114300" simplePos="0" relativeHeight="251640320" behindDoc="0" locked="0" layoutInCell="1" allowOverlap="1" wp14:anchorId="7854A8A1" wp14:editId="7935D37D">
+                <wp:simplePos x="0" y="0"/>
+                <wp:positionH relativeFrom="column">
+                  <wp:posOffset>1674495</wp:posOffset>
+                </wp:positionH>
+                <wp:positionV relativeFrom="paragraph">
+                  <wp:posOffset>178435</wp:posOffset>
+                </wp:positionV>
+                <wp:extent cx="914400" cy="468086"/>
+                <wp:effectExtent l="0" t="0" r="19050" b="27305"/>
+                <wp:wrapNone/>
+                <wp:docPr id="1513546051" name="Rectangle: Rounded Corners 8"/>
+                <wp:cNvGraphicFramePr/>
+                <a:graphic xmlns:a="http://schemas.openxmlformats.org/drawingml/2006/main">
+                  <a:graphicData uri="http://schemas.microsoft.com/office/word/2010/wordprocessingShape">
+                    <wps:wsp>
+                      <wps:cNvSpPr/>
+                      <wps:spPr>
+                        <a:xfrm>
+                          <a:off x="0" y="0"/>
+                          <a:ext cx="914400" cy="468086"/>
+                        </a:xfrm>
+                        <a:prstGeom prst="roundRect">
+                          <a:avLst/>
+                        </a:prstGeom>
+                      </wps:spPr>
+                      <wps:style>
+                        <a:lnRef idx="2">
+                          <a:schemeClr val="accent1">
+                            <a:shade val="15000"/>
+                          </a:schemeClr>
+                        </a:lnRef>
+                        <a:fillRef idx="1">
+                          <a:schemeClr val="accent1"/>
+                        </a:fillRef>
+                        <a:effectRef idx="0">
+                          <a:schemeClr val="accent1"/>
+                        </a:effectRef>
+                        <a:fontRef idx="minor">
+                          <a:schemeClr val="lt1"/>
+                        </a:fontRef>
+                      </wps:style>
+                      <wps:txbx>
+                        <w:txbxContent>
+                          <w:p>
+                            <w:pPr>
+                              <w:jc w:val="center"/>
+                              <w:rPr>
+                                <w:rtl/>
+                                <w:lang w:bidi="ar-EG"/>
+                              </w:rPr>
+                            </w:pPr>
+                            <w:r>
+                              <w:rPr>
+                                <w:lang w:bidi="ar-EG"/>
+                              </w:rPr>
+                              <w:t>Folder</w:t>
+                            </w:r>
+                          </w:p>
+                        </w:txbxContent>
+                      </wps:txbx>
+                      <wps:bodyPr rot="0" spcFirstLastPara="0" vertOverflow="overflow" horzOverflow="overflow" vert="horz" wrap="square" lIns="91440" tIns="45720" rIns="91440" bIns="45720" numCol="1" spcCol="0" rtlCol="1" fromWordArt="0" anchor="ctr" anchorCtr="0" forceAA="0" compatLnSpc="1">
+                        <a:prstTxWarp prst="textNoShape">
+                          <a:avLst/>
+                        </a:prstTxWarp>
+                        <a:noAutofit/>
+                      </wps:bodyPr>
+                    </wps:wsp>
+                  </a:graphicData>
+                </a:graphic>
+                <wp14:sizeRelV relativeFrom="margin">
+                  <wp14:pctHeight>0</wp14:pctHeight>
+                </wp14:sizeRelV>
+              </wp:anchor>
+            </w:drawing>
+          </mc:Choice>
+          <mc:Fallback>
+            <w:pict>
+              <v:roundrect w14:anchorId="7854A8A1" id="_x0000_s1030" style="position:absolute;margin-left:131.85pt;margin-top:14.05pt;width:1in;height:36.85pt;z-index:251640320;visibility:visible;mso-wrap-style:square;mso-height-percent:0;mso-wrap-distance-left:9pt;mso-wrap-distance-top:0;mso-wrap-distance-right:9pt;mso-wrap-distance-bottom:0;mso-position-horizontal:absolute;mso-position-horizontal-relative:text;mso-position-vertical:absolute;mso-position-vertical-relative:text;mso-height-percent:0;mso-height-relative:margin;v-text-anchor:middle" arcsize="10923f" o:gfxdata="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" fillcolor="#4f81bd [3204]" strokecolor="#0a121c [484]" strokeweight="2pt">
+                <v:textbox>
+                  <w:txbxContent>
+                    <w:p>
+                      <w:pPr>
+                        <w:jc w:val="center"/>
+                        <w:rPr>
+                          <w:rtl/>
+                          <w:lang w:bidi="ar-EG"/>
+                        </w:rPr>
+                      </w:pPr>
+                      <w:r>
+                        <w:rPr>
+                          <w:lang w:bidi="ar-EG"/>
+                        </w:rPr>
+                        <w:t>Folder</w:t>
+                      </w:r>
+                    </w:p>
+                  </w:txbxContent>
+                </v:textbox>
+              </v:roundrect>
+            </w:pict>
+          </mc:Fallback>
+        </mc:AlternateContent>
+      </w:r>
+      <w:r>
+        <w:rPr>
+          <w:rFonts w:ascii="Lucida Bright" w:hAnsi="Lucida Bright"/>
+          <w:noProof/>
+          <w:sz w:val="36"/>
+          <w:szCs w:val="36"/>
+        </w:rPr>
+        <mc:AlternateContent>
+          <mc:Choice Requires="wps">
+            <w:drawing>
+              <wp:anchor distT="45720" distB="45720" distL="114300" distR="114300" simplePos="0" relativeHeight="251635200" behindDoc="0" locked="0" layoutInCell="1" allowOverlap="1" wp14:anchorId="632B52CA" wp14:editId="48371EF0">
+                <wp:simplePos x="0" y="0"/>
+                <wp:positionH relativeFrom="column">
+                  <wp:posOffset>1997075</wp:posOffset>
+                </wp:positionH>
+                <wp:positionV relativeFrom="paragraph">
+                  <wp:posOffset>5238750</wp:posOffset>
+                </wp:positionV>
+                <wp:extent cx="2360930" cy="1404620"/>
+                <wp:effectExtent l="0" t="0" r="19050" b="24130"/>
+                <wp:wrapNone/>
+                <wp:docPr id="217" name="Text Box 2"/>
+                <wp:cNvGraphicFramePr>
+                  <a:graphicFrameLocks xmlns:a="http://schemas.openxmlformats.org/drawingml/2006/main"/>
+                </wp:cNvGraphicFramePr>
+                <a:graphic xmlns:a="http://schemas.openxmlformats.org/drawingml/2006/main">
+                  <a:graphicData uri="http://schemas.microsoft.com/office/word/2010/wordprocessingShape">
+                    <wps:wsp>
+                      <wps:cNvSpPr txBox="1">
+                        <a:spLocks noChangeArrowheads="1"/>
+                      </wps:cNvSpPr>
+                      <wps:spPr bwMode="auto">
+                        <a:xfrm>
+                          <a:off x="0" y="0"/>
+                          <a:ext cx="2360930" cy="1404620"/>
+                        </a:xfrm>
+                        <a:prstGeom prst="rect">
+                          <a:avLst/>
+                        </a:prstGeom>
+                        <a:solidFill>
+                          <a:srgbClr val="FFFFFF"/>
+                        </a:solidFill>
+                        <a:ln w="9525">
+                          <a:solidFill>
+                            <a:srgbClr val="000000"/>
+                          </a:solidFill>
+                          <a:miter lim="800000"/>
+                          <a:headEnd/>
+                          <a:tailEnd/>
+                        </a:ln>
+                      </wps:spPr>
+                      <wps:txbx>
+                        <w:txbxContent>
+                          <w:p>
+                            <w:pPr>
+                              <w:bidi w:val="0"/>
+                              <w:jc w:val="center"/>
+                              <w:rPr>
+                                <w:rFonts w:ascii="Lucida Bright" w:hAnsi="Lucida Bright"/>
+                                <w:b/>
+                                <w:bCs/>
+                                <w:sz w:val="72"/>
+                                <w:szCs w:val="72"/>
+                              </w:rPr>
+                            </w:pPr>
+                            <w:r>
+                              <w:rPr>
+                                <w:rFonts w:ascii="Lucida Bright" w:hAnsi="Lucida Bright"/>
+                                <w:b/>
+                                <w:bCs/>
+                                <w:sz w:val="72"/>
+                                <w:szCs w:val="72"/>
+                              </w:rPr>
+                              <w:t>Good Luck</w:t>
+                            </w:r>
+                          </w:p>
+                          <w:p/>
+                        </w:txbxContent>
+                      </wps:txbx>
+                      <wps:bodyPr rot="0" vert="horz" wrap="square" lIns="91440" tIns="45720" rIns="91440" bIns="45720" anchor="t" anchorCtr="0">
+                        <a:spAutoFit/>
+                      </wps:bodyPr>
+                    </wps:wsp>
+                  </a:graphicData>
+                </a:graphic>
+                <wp14:sizeRelH relativeFrom="margin">
+                  <wp14:pctWidth>40000</wp14:pctWidth>
+                </wp14:sizeRelH>
+                <wp14:sizeRelV relativeFrom="margin">
+                  <wp14:pctHeight>20000</wp14:pctHeight>
+                </wp14:sizeRelV>
+              </wp:anchor>
+            </w:drawing>
+          </mc:Choice>
+          <mc:Fallback>
+            <w:pict>
+              <v:shapetype w14:anchorId="632B52CA" id="_x0000_t202" coordsize="21600,21600" o:spt="202" path="m,l,21600r21600,l21600,xe">
+                <v:stroke joinstyle="miter"/>
+                <v:path gradientshapeok="t" o:connecttype="rect"/>
+              </v:shapetype>
+              <v:shape id="Text Box 2" o:spid="_x0000_s1031" type="#_x0000_t202" style="position:absolute;margin-left:157.25pt;margin-top:412.5pt;width:185.9pt;height:110.6pt;z-index:251635200;visibility:visible;mso-wrap-style:square;mso-width-percent:400;mso-height-percent:200;mso-wrap-distance-left:9pt;mso-wrap-distance-top:3.6pt;mso-wrap-distance-right:9pt;mso-wrap-distance-bottom:3.6pt;mso-position-horizontal:absolute;mso-position-horizontal-relative:text;mso-position-vertical:absolute;mso-position-vertical-relative:text;mso-width-percent:400;mso-height-percent:200;mso-width-relative:margin;mso-height-relative:margin;v-text-anchor:top" o:gfxdata="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">
+                <v:textbox style="mso-fit-shape-to-text:t">
+                  <w:txbxContent>
+                    <w:p>
+                      <w:pPr>
+                        <w:bidi w:val="0"/>
+                        <w:jc w:val="center"/>
+                        <w:rPr>
+                          <w:rFonts w:ascii="Lucida Bright" w:hAnsi="Lucida Bright"/>
+                          <w:b/>
+                          <w:bCs/>
+                          <w:sz w:val="72"/>
+                          <w:szCs w:val="72"/>
+                        </w:rPr>
+                      </w:pPr>
+                      <w:r>
+                        <w:rPr>
+                          <w:rFonts w:ascii="Lucida Bright" w:hAnsi="Lucida Bright"/>
+                          <w:b/>
+                          <w:bCs/>
+                          <w:sz w:val="72"/>
+                          <w:szCs w:val="72"/>
+                        </w:rPr>
+                        <w:t>Good Luck</w:t>
+                      </w:r>
+                    </w:p>
+                    <w:p/>
+                  </w:txbxContent>
+                </v:textbox>
+              </v:shape>
+            </w:pict>
+          </mc:Fallback>
+        </mc:AlternateContent>
+      </w:r>
     </w:p>
     <w:sectPr>
-      <w:headerReference w:type="default" r:id="rId7"/>
+      <w:headerReference w:type="default" r:id="rId11"/>
       <w:pgSz w:w="12240" w:h="15840"/>
       <w:pgMar w:top="720" w:right="720" w:bottom="720" w:left="720" w:header="720" w:footer="720" w:gutter="0"/>
       <w:pgBorders w:offsetFrom="page">
@@ -1412,17 +2417,6 @@
       </w:tblBorders>
     </w:tblPr>
   </w:style>
-  <w:style w:type="paragraph" w:styleId="ListParagraph">
-    <w:name w:val="List Paragraph"/>
-    <w:basedOn w:val="Normal"/>
-    <w:uiPriority w:val="34"/>
-    <w:qFormat/>
-    <w:rsid w:val="0072355F"/>
-    <w:pPr>
-      <w:ind w:left="720"/>
-      <w:contextualSpacing/>
-    </w:pPr>
-  </w:style>
 </w:styles>
 </file>
 
@@ -1716,7 +2710,7 @@
 </file>
 
 <file path=customXml/itemProps1.xml><?xml version="1.0" encoding="utf-8"?>
-<ds:datastoreItem xmlns:ds="http://schemas.openxmlformats.org/officeDocument/2006/customXml" ds:itemID="{35814A1D-09A7-49C6-95BE-D8E62D61E4EE}">
+<ds:datastoreItem xmlns:ds="http://schemas.openxmlformats.org/officeDocument/2006/customXml" ds:itemID="{2324520D-4118-42FB-AB4C-EDC1F1BA75B1}">
   <ds:schemaRefs>
     <ds:schemaRef ds:uri="http://schemas.openxmlformats.org/officeDocument/2006/bibliography"/>
   </ds:schemaRefs>

</xml_diff>